<commit_message>
Style activity titles as Heading 1 (20pt) and section headers as Heading 2 (14pt)
Co-authored-by: arena-agent <297053741+arena-agent@users.noreply.github.com>
</commit_message>
<xml_diff>
--- a/COMPILATION.docx
+++ b/COMPILATION.docx
@@ -5,18 +5,30 @@
     <w:p>
       <w:pPr>
         <w:pStyle w:val="Heading1"/>
-        <w:spacing w:before="120" w:after="160"/>
+        <w:spacing w:before="240" w:after="160"/>
       </w:pPr>
       <w:r>
+        <w:rPr>
+          <w:rFonts w:ascii="Calibri" w:hAnsi="Calibri"/>
+          <w:b/>
+          <w:color w:val="000000"/>
+          <w:sz w:val="40"/>
+        </w:rPr>
         <w:t>Activity 1 - Act1_Activity202606241600</w:t>
       </w:r>
     </w:p>
     <w:p>
       <w:pPr>
         <w:pStyle w:val="Heading2"/>
-        <w:spacing w:before="120" w:after="80"/>
+        <w:spacing w:before="200" w:after="80"/>
       </w:pPr>
       <w:r>
+        <w:rPr>
+          <w:rFonts w:ascii="Calibri" w:hAnsi="Calibri"/>
+          <w:b/>
+          <w:color w:val="000000"/>
+          <w:sz w:val="28"/>
+        </w:rPr>
         <w:t>Source Code</w:t>
       </w:r>
     </w:p>
@@ -68,9 +80,15 @@
     <w:p>
       <w:pPr>
         <w:pStyle w:val="Heading2"/>
-        <w:spacing w:before="160" w:after="80"/>
+        <w:spacing w:before="200" w:after="80"/>
       </w:pPr>
       <w:r>
+        <w:rPr>
+          <w:rFonts w:ascii="Calibri" w:hAnsi="Calibri"/>
+          <w:b/>
+          <w:color w:val="000000"/>
+          <w:sz w:val="28"/>
+        </w:rPr>
         <w:t>Sample Run</w:t>
       </w:r>
     </w:p>
@@ -121,18 +139,30 @@
     <w:p>
       <w:pPr>
         <w:pStyle w:val="Heading1"/>
-        <w:spacing w:before="120" w:after="160"/>
+        <w:spacing w:before="240" w:after="160"/>
       </w:pPr>
       <w:r>
+        <w:rPr>
+          <w:rFonts w:ascii="Calibri" w:hAnsi="Calibri"/>
+          <w:b/>
+          <w:color w:val="000000"/>
+          <w:sz w:val="40"/>
+        </w:rPr>
         <w:t>Activity 2 - Act2 Celcius-Fahrenheit Converter</w:t>
       </w:r>
     </w:p>
     <w:p>
       <w:pPr>
         <w:pStyle w:val="Heading2"/>
-        <w:spacing w:before="120" w:after="80"/>
+        <w:spacing w:before="200" w:after="80"/>
       </w:pPr>
       <w:r>
+        <w:rPr>
+          <w:rFonts w:ascii="Calibri" w:hAnsi="Calibri"/>
+          <w:b/>
+          <w:color w:val="000000"/>
+          <w:sz w:val="28"/>
+        </w:rPr>
         <w:t>Source Code</w:t>
       </w:r>
     </w:p>
@@ -215,9 +245,15 @@
     <w:p>
       <w:pPr>
         <w:pStyle w:val="Heading2"/>
-        <w:spacing w:before="160" w:after="80"/>
+        <w:spacing w:before="200" w:after="80"/>
       </w:pPr>
       <w:r>
+        <w:rPr>
+          <w:rFonts w:ascii="Calibri" w:hAnsi="Calibri"/>
+          <w:b/>
+          <w:color w:val="000000"/>
+          <w:sz w:val="28"/>
+        </w:rPr>
         <w:t>Sample Run</w:t>
       </w:r>
     </w:p>
@@ -268,18 +304,30 @@
     <w:p>
       <w:pPr>
         <w:pStyle w:val="Heading1"/>
-        <w:spacing w:before="120" w:after="160"/>
+        <w:spacing w:before="240" w:after="160"/>
       </w:pPr>
       <w:r>
+        <w:rPr>
+          <w:rFonts w:ascii="Calibri" w:hAnsi="Calibri"/>
+          <w:b/>
+          <w:color w:val="000000"/>
+          <w:sz w:val="40"/>
+        </w:rPr>
         <w:t>Activity 3 - Activity3_20260629</w:t>
       </w:r>
     </w:p>
     <w:p>
       <w:pPr>
         <w:pStyle w:val="Heading2"/>
-        <w:spacing w:before="120" w:after="80"/>
+        <w:spacing w:before="200" w:after="80"/>
       </w:pPr>
       <w:r>
+        <w:rPr>
+          <w:rFonts w:ascii="Calibri" w:hAnsi="Calibri"/>
+          <w:b/>
+          <w:color w:val="000000"/>
+          <w:sz w:val="28"/>
+        </w:rPr>
         <w:t>Source Code</w:t>
       </w:r>
     </w:p>
@@ -385,9 +433,15 @@
     <w:p>
       <w:pPr>
         <w:pStyle w:val="Heading2"/>
-        <w:spacing w:before="160" w:after="80"/>
+        <w:spacing w:before="200" w:after="80"/>
       </w:pPr>
       <w:r>
+        <w:rPr>
+          <w:rFonts w:ascii="Calibri" w:hAnsi="Calibri"/>
+          <w:b/>
+          <w:color w:val="000000"/>
+          <w:sz w:val="28"/>
+        </w:rPr>
         <w:t>Sample Run</w:t>
       </w:r>
     </w:p>
@@ -438,18 +492,30 @@
     <w:p>
       <w:pPr>
         <w:pStyle w:val="Heading1"/>
-        <w:spacing w:before="120" w:after="160"/>
+        <w:spacing w:before="240" w:after="160"/>
       </w:pPr>
       <w:r>
+        <w:rPr>
+          <w:rFonts w:ascii="Calibri" w:hAnsi="Calibri"/>
+          <w:b/>
+          <w:color w:val="000000"/>
+          <w:sz w:val="40"/>
+        </w:rPr>
         <w:t>Activity 4 - Activity4_20260703</w:t>
       </w:r>
     </w:p>
     <w:p>
       <w:pPr>
         <w:pStyle w:val="Heading2"/>
-        <w:spacing w:before="120" w:after="80"/>
+        <w:spacing w:before="200" w:after="80"/>
       </w:pPr>
       <w:r>
+        <w:rPr>
+          <w:rFonts w:ascii="Calibri" w:hAnsi="Calibri"/>
+          <w:b/>
+          <w:color w:val="000000"/>
+          <w:sz w:val="28"/>
+        </w:rPr>
         <w:t>Source Code</w:t>
       </w:r>
     </w:p>
@@ -708,9 +774,15 @@
     <w:p>
       <w:pPr>
         <w:pStyle w:val="Heading2"/>
-        <w:spacing w:before="160" w:after="80"/>
+        <w:spacing w:before="200" w:after="80"/>
       </w:pPr>
       <w:r>
+        <w:rPr>
+          <w:rFonts w:ascii="Calibri" w:hAnsi="Calibri"/>
+          <w:b/>
+          <w:color w:val="000000"/>
+          <w:sz w:val="28"/>
+        </w:rPr>
         <w:t>Sample Run</w:t>
       </w:r>
     </w:p>
@@ -756,9 +828,15 @@
     <w:p>
       <w:pPr>
         <w:pStyle w:val="Heading2"/>
-        <w:spacing w:before="160" w:after="80"/>
+        <w:spacing w:before="200" w:after="80"/>
       </w:pPr>
       <w:r>
+        <w:rPr>
+          <w:rFonts w:ascii="Calibri" w:hAnsi="Calibri"/>
+          <w:b/>
+          <w:color w:val="000000"/>
+          <w:sz w:val="28"/>
+        </w:rPr>
         <w:t>Form Design</w:t>
       </w:r>
     </w:p>
@@ -809,18 +887,30 @@
     <w:p>
       <w:pPr>
         <w:pStyle w:val="Heading1"/>
-        <w:spacing w:before="120" w:after="160"/>
+        <w:spacing w:before="240" w:after="160"/>
       </w:pPr>
       <w:r>
+        <w:rPr>
+          <w:rFonts w:ascii="Calibri" w:hAnsi="Calibri"/>
+          <w:b/>
+          <w:color w:val="000000"/>
+          <w:sz w:val="40"/>
+        </w:rPr>
         <w:t>Activity 5</w:t>
       </w:r>
     </w:p>
     <w:p>
       <w:pPr>
         <w:pStyle w:val="Heading2"/>
-        <w:spacing w:before="120" w:after="80"/>
+        <w:spacing w:before="200" w:after="80"/>
       </w:pPr>
       <w:r>
+        <w:rPr>
+          <w:rFonts w:ascii="Calibri" w:hAnsi="Calibri"/>
+          <w:b/>
+          <w:color w:val="000000"/>
+          <w:sz w:val="28"/>
+        </w:rPr>
         <w:t>Source Code</w:t>
       </w:r>
     </w:p>
@@ -968,9 +1058,15 @@
     <w:p>
       <w:pPr>
         <w:pStyle w:val="Heading2"/>
-        <w:spacing w:before="160" w:after="80"/>
+        <w:spacing w:before="200" w:after="80"/>
       </w:pPr>
       <w:r>
+        <w:rPr>
+          <w:rFonts w:ascii="Calibri" w:hAnsi="Calibri"/>
+          <w:b/>
+          <w:color w:val="000000"/>
+          <w:sz w:val="28"/>
+        </w:rPr>
         <w:t>Sample Run</w:t>
       </w:r>
     </w:p>
@@ -1016,9 +1112,15 @@
     <w:p>
       <w:pPr>
         <w:pStyle w:val="Heading2"/>
-        <w:spacing w:before="160" w:after="80"/>
+        <w:spacing w:before="200" w:after="80"/>
       </w:pPr>
       <w:r>
+        <w:rPr>
+          <w:rFonts w:ascii="Calibri" w:hAnsi="Calibri"/>
+          <w:b/>
+          <w:color w:val="000000"/>
+          <w:sz w:val="28"/>
+        </w:rPr>
         <w:t>Form Design</w:t>
       </w:r>
     </w:p>
@@ -1069,18 +1171,30 @@
     <w:p>
       <w:pPr>
         <w:pStyle w:val="Heading1"/>
-        <w:spacing w:before="120" w:after="160"/>
+        <w:spacing w:before="240" w:after="160"/>
       </w:pPr>
       <w:r>
+        <w:rPr>
+          <w:rFonts w:ascii="Calibri" w:hAnsi="Calibri"/>
+          <w:b/>
+          <w:color w:val="000000"/>
+          <w:sz w:val="40"/>
+        </w:rPr>
         <w:t>Activity 6 - Act6_IntegProg1_20260715</w:t>
       </w:r>
     </w:p>
     <w:p>
       <w:pPr>
         <w:pStyle w:val="Heading2"/>
-        <w:spacing w:before="120" w:after="80"/>
+        <w:spacing w:before="200" w:after="80"/>
       </w:pPr>
       <w:r>
+        <w:rPr>
+          <w:rFonts w:ascii="Calibri" w:hAnsi="Calibri"/>
+          <w:b/>
+          <w:color w:val="000000"/>
+          <w:sz w:val="28"/>
+        </w:rPr>
         <w:t>Source Code</w:t>
       </w:r>
     </w:p>
@@ -1384,9 +1498,15 @@
     <w:p>
       <w:pPr>
         <w:pStyle w:val="Heading2"/>
-        <w:spacing w:before="160" w:after="80"/>
+        <w:spacing w:before="200" w:after="80"/>
       </w:pPr>
       <w:r>
+        <w:rPr>
+          <w:rFonts w:ascii="Calibri" w:hAnsi="Calibri"/>
+          <w:b/>
+          <w:color w:val="000000"/>
+          <w:sz w:val="28"/>
+        </w:rPr>
         <w:t>Sample Run</w:t>
       </w:r>
     </w:p>
@@ -1432,9 +1552,15 @@
     <w:p>
       <w:pPr>
         <w:pStyle w:val="Heading2"/>
-        <w:spacing w:before="160" w:after="80"/>
+        <w:spacing w:before="200" w:after="80"/>
       </w:pPr>
       <w:r>
+        <w:rPr>
+          <w:rFonts w:ascii="Calibri" w:hAnsi="Calibri"/>
+          <w:b/>
+          <w:color w:val="000000"/>
+          <w:sz w:val="28"/>
+        </w:rPr>
         <w:t>Form Design</w:t>
       </w:r>
     </w:p>
@@ -1485,18 +1611,30 @@
     <w:p>
       <w:pPr>
         <w:pStyle w:val="Heading1"/>
-        <w:spacing w:before="120" w:after="160"/>
+        <w:spacing w:before="240" w:after="160"/>
       </w:pPr>
       <w:r>
+        <w:rPr>
+          <w:rFonts w:ascii="Calibri" w:hAnsi="Calibri"/>
+          <w:b/>
+          <w:color w:val="000000"/>
+          <w:sz w:val="40"/>
+        </w:rPr>
         <w:t>Activity 7 - Act7_IntegProg1_SW20260720</w:t>
       </w:r>
     </w:p>
     <w:p>
       <w:pPr>
         <w:pStyle w:val="Heading2"/>
-        <w:spacing w:before="120" w:after="80"/>
+        <w:spacing w:before="200" w:after="80"/>
       </w:pPr>
       <w:r>
+        <w:rPr>
+          <w:rFonts w:ascii="Calibri" w:hAnsi="Calibri"/>
+          <w:b/>
+          <w:color w:val="000000"/>
+          <w:sz w:val="28"/>
+        </w:rPr>
         <w:t>Source Code</w:t>
       </w:r>
     </w:p>
@@ -1806,9 +1944,15 @@
     <w:p>
       <w:pPr>
         <w:pStyle w:val="Heading2"/>
-        <w:spacing w:before="160" w:after="80"/>
+        <w:spacing w:before="200" w:after="80"/>
       </w:pPr>
       <w:r>
+        <w:rPr>
+          <w:rFonts w:ascii="Calibri" w:hAnsi="Calibri"/>
+          <w:b/>
+          <w:color w:val="000000"/>
+          <w:sz w:val="28"/>
+        </w:rPr>
         <w:t>Sample Run</w:t>
       </w:r>
     </w:p>
@@ -1854,9 +1998,15 @@
     <w:p>
       <w:pPr>
         <w:pStyle w:val="Heading2"/>
-        <w:spacing w:before="160" w:after="80"/>
+        <w:spacing w:before="200" w:after="80"/>
       </w:pPr>
       <w:r>
+        <w:rPr>
+          <w:rFonts w:ascii="Calibri" w:hAnsi="Calibri"/>
+          <w:b/>
+          <w:color w:val="000000"/>
+          <w:sz w:val="28"/>
+        </w:rPr>
         <w:t>Form Design</w:t>
       </w:r>
     </w:p>
@@ -1907,18 +2057,30 @@
     <w:p>
       <w:pPr>
         <w:pStyle w:val="Heading1"/>
-        <w:spacing w:before="120" w:after="160"/>
+        <w:spacing w:before="240" w:after="160"/>
       </w:pPr>
       <w:r>
+        <w:rPr>
+          <w:rFonts w:ascii="Calibri" w:hAnsi="Calibri"/>
+          <w:b/>
+          <w:color w:val="000000"/>
+          <w:sz w:val="40"/>
+        </w:rPr>
         <w:t>Activity 8 - Act8_SW20260805</w:t>
       </w:r>
     </w:p>
     <w:p>
       <w:pPr>
         <w:pStyle w:val="Heading2"/>
-        <w:spacing w:before="120" w:after="80"/>
+        <w:spacing w:before="200" w:after="80"/>
       </w:pPr>
       <w:r>
+        <w:rPr>
+          <w:rFonts w:ascii="Calibri" w:hAnsi="Calibri"/>
+          <w:b/>
+          <w:color w:val="000000"/>
+          <w:sz w:val="28"/>
+        </w:rPr>
         <w:t>Source Code</w:t>
       </w:r>
     </w:p>
@@ -2425,9 +2587,15 @@
     <w:p>
       <w:pPr>
         <w:pStyle w:val="Heading2"/>
-        <w:spacing w:before="160" w:after="80"/>
+        <w:spacing w:before="200" w:after="80"/>
       </w:pPr>
       <w:r>
+        <w:rPr>
+          <w:rFonts w:ascii="Calibri" w:hAnsi="Calibri"/>
+          <w:b/>
+          <w:color w:val="000000"/>
+          <w:sz w:val="28"/>
+        </w:rPr>
         <w:t>Sample Run</w:t>
       </w:r>
     </w:p>
@@ -2473,9 +2641,15 @@
     <w:p>
       <w:pPr>
         <w:pStyle w:val="Heading2"/>
-        <w:spacing w:before="160" w:after="80"/>
+        <w:spacing w:before="200" w:after="80"/>
       </w:pPr>
       <w:r>
+        <w:rPr>
+          <w:rFonts w:ascii="Calibri" w:hAnsi="Calibri"/>
+          <w:b/>
+          <w:color w:val="000000"/>
+          <w:sz w:val="28"/>
+        </w:rPr>
         <w:t>Form Design</w:t>
       </w:r>
     </w:p>
@@ -2526,18 +2700,30 @@
     <w:p>
       <w:pPr>
         <w:pStyle w:val="Heading1"/>
-        <w:spacing w:before="120" w:after="160"/>
+        <w:spacing w:before="240" w:after="160"/>
       </w:pPr>
       <w:r>
+        <w:rPr>
+          <w:rFonts w:ascii="Calibri" w:hAnsi="Calibri"/>
+          <w:b/>
+          <w:color w:val="000000"/>
+          <w:sz w:val="40"/>
+        </w:rPr>
         <w:t>Activity 9 - SW202609301600</w:t>
       </w:r>
     </w:p>
     <w:p>
       <w:pPr>
         <w:pStyle w:val="Heading2"/>
-        <w:spacing w:before="120" w:after="80"/>
+        <w:spacing w:before="200" w:after="80"/>
       </w:pPr>
       <w:r>
+        <w:rPr>
+          <w:rFonts w:ascii="Calibri" w:hAnsi="Calibri"/>
+          <w:b/>
+          <w:color w:val="000000"/>
+          <w:sz w:val="28"/>
+        </w:rPr>
         <w:t>Source Code</w:t>
       </w:r>
     </w:p>
@@ -2756,9 +2942,15 @@
     <w:p>
       <w:pPr>
         <w:pStyle w:val="Heading2"/>
-        <w:spacing w:before="160" w:after="80"/>
+        <w:spacing w:before="200" w:after="80"/>
       </w:pPr>
       <w:r>
+        <w:rPr>
+          <w:rFonts w:ascii="Calibri" w:hAnsi="Calibri"/>
+          <w:b/>
+          <w:color w:val="000000"/>
+          <w:sz w:val="28"/>
+        </w:rPr>
         <w:t>Sample Run</w:t>
       </w:r>
     </w:p>
@@ -2804,9 +2996,15 @@
     <w:p>
       <w:pPr>
         <w:pStyle w:val="Heading2"/>
-        <w:spacing w:before="160" w:after="80"/>
+        <w:spacing w:before="200" w:after="80"/>
       </w:pPr>
       <w:r>
+        <w:rPr>
+          <w:rFonts w:ascii="Calibri" w:hAnsi="Calibri"/>
+          <w:b/>
+          <w:color w:val="000000"/>
+          <w:sz w:val="28"/>
+        </w:rPr>
         <w:t>Form Design</w:t>
       </w:r>
     </w:p>
@@ -2857,18 +3055,30 @@
     <w:p>
       <w:pPr>
         <w:pStyle w:val="Heading1"/>
-        <w:spacing w:before="120" w:after="160"/>
+        <w:spacing w:before="240" w:after="160"/>
       </w:pPr>
       <w:r>
+        <w:rPr>
+          <w:rFonts w:ascii="Calibri" w:hAnsi="Calibri"/>
+          <w:b/>
+          <w:color w:val="000000"/>
+          <w:sz w:val="40"/>
+        </w:rPr>
         <w:t>Activity 10 - SW20261002</w:t>
       </w:r>
     </w:p>
     <w:p>
       <w:pPr>
         <w:pStyle w:val="Heading2"/>
-        <w:spacing w:before="120" w:after="80"/>
+        <w:spacing w:before="200" w:after="80"/>
       </w:pPr>
       <w:r>
+        <w:rPr>
+          <w:rFonts w:ascii="Calibri" w:hAnsi="Calibri"/>
+          <w:b/>
+          <w:color w:val="000000"/>
+          <w:sz w:val="28"/>
+        </w:rPr>
         <w:t>Source Code</w:t>
       </w:r>
     </w:p>
@@ -3333,9 +3543,15 @@
     <w:p>
       <w:pPr>
         <w:pStyle w:val="Heading2"/>
-        <w:spacing w:before="160" w:after="80"/>
+        <w:spacing w:before="200" w:after="80"/>
       </w:pPr>
       <w:r>
+        <w:rPr>
+          <w:rFonts w:ascii="Calibri" w:hAnsi="Calibri"/>
+          <w:b/>
+          <w:color w:val="000000"/>
+          <w:sz w:val="28"/>
+        </w:rPr>
         <w:t>Sample Run</w:t>
       </w:r>
     </w:p>
@@ -3381,9 +3597,15 @@
     <w:p>
       <w:pPr>
         <w:pStyle w:val="Heading2"/>
-        <w:spacing w:before="160" w:after="80"/>
+        <w:spacing w:before="200" w:after="80"/>
       </w:pPr>
       <w:r>
+        <w:rPr>
+          <w:rFonts w:ascii="Calibri" w:hAnsi="Calibri"/>
+          <w:b/>
+          <w:color w:val="000000"/>
+          <w:sz w:val="28"/>
+        </w:rPr>
         <w:t>Form Design</w:t>
       </w:r>
     </w:p>
@@ -3434,18 +3656,30 @@
     <w:p>
       <w:pPr>
         <w:pStyle w:val="Heading1"/>
-        <w:spacing w:before="120" w:after="160"/>
+        <w:spacing w:before="240" w:after="160"/>
       </w:pPr>
       <w:r>
+        <w:rPr>
+          <w:rFonts w:ascii="Calibri" w:hAnsi="Calibri"/>
+          <w:b/>
+          <w:color w:val="000000"/>
+          <w:sz w:val="40"/>
+        </w:rPr>
         <w:t>Activity 11 - SW202610021600</w:t>
       </w:r>
     </w:p>
     <w:p>
       <w:pPr>
         <w:pStyle w:val="Heading2"/>
-        <w:spacing w:before="120" w:after="80"/>
+        <w:spacing w:before="200" w:after="80"/>
       </w:pPr>
       <w:r>
+        <w:rPr>
+          <w:rFonts w:ascii="Calibri" w:hAnsi="Calibri"/>
+          <w:b/>
+          <w:color w:val="000000"/>
+          <w:sz w:val="28"/>
+        </w:rPr>
         <w:t>Source Code</w:t>
       </w:r>
     </w:p>
@@ -3985,9 +4219,15 @@
     <w:p>
       <w:pPr>
         <w:pStyle w:val="Heading2"/>
-        <w:spacing w:before="160" w:after="80"/>
+        <w:spacing w:before="200" w:after="80"/>
       </w:pPr>
       <w:r>
+        <w:rPr>
+          <w:rFonts w:ascii="Calibri" w:hAnsi="Calibri"/>
+          <w:b/>
+          <w:color w:val="000000"/>
+          <w:sz w:val="28"/>
+        </w:rPr>
         <w:t>Sample Run</w:t>
       </w:r>
     </w:p>
@@ -4033,9 +4273,15 @@
     <w:p>
       <w:pPr>
         <w:pStyle w:val="Heading2"/>
-        <w:spacing w:before="160" w:after="80"/>
+        <w:spacing w:before="200" w:after="80"/>
       </w:pPr>
       <w:r>
+        <w:rPr>
+          <w:rFonts w:ascii="Calibri" w:hAnsi="Calibri"/>
+          <w:b/>
+          <w:color w:val="000000"/>
+          <w:sz w:val="28"/>
+        </w:rPr>
         <w:t>Form Design</w:t>
       </w:r>
     </w:p>
@@ -4086,18 +4332,30 @@
     <w:p>
       <w:pPr>
         <w:pStyle w:val="Heading1"/>
-        <w:spacing w:before="120" w:after="160"/>
+        <w:spacing w:before="240" w:after="160"/>
       </w:pPr>
       <w:r>
+        <w:rPr>
+          <w:rFonts w:ascii="Calibri" w:hAnsi="Calibri"/>
+          <w:b/>
+          <w:color w:val="000000"/>
+          <w:sz w:val="40"/>
+        </w:rPr>
         <w:t>Activity 12</w:t>
       </w:r>
     </w:p>
     <w:p>
       <w:pPr>
         <w:pStyle w:val="Heading2"/>
-        <w:spacing w:before="120" w:after="80"/>
+        <w:spacing w:before="200" w:after="80"/>
       </w:pPr>
       <w:r>
+        <w:rPr>
+          <w:rFonts w:ascii="Calibri" w:hAnsi="Calibri"/>
+          <w:b/>
+          <w:color w:val="000000"/>
+          <w:sz w:val="28"/>
+        </w:rPr>
         <w:t>Source Code</w:t>
       </w:r>
     </w:p>
@@ -6699,9 +6957,15 @@
     <w:p>
       <w:pPr>
         <w:pStyle w:val="Heading2"/>
-        <w:spacing w:before="160" w:after="80"/>
+        <w:spacing w:before="200" w:after="80"/>
       </w:pPr>
       <w:r>
+        <w:rPr>
+          <w:rFonts w:ascii="Calibri" w:hAnsi="Calibri"/>
+          <w:b/>
+          <w:color w:val="000000"/>
+          <w:sz w:val="28"/>
+        </w:rPr>
         <w:t>Sample Run</w:t>
       </w:r>
     </w:p>
@@ -6747,9 +7011,15 @@
     <w:p>
       <w:pPr>
         <w:pStyle w:val="Heading2"/>
-        <w:spacing w:before="160" w:after="80"/>
+        <w:spacing w:before="200" w:after="80"/>
       </w:pPr>
       <w:r>
+        <w:rPr>
+          <w:rFonts w:ascii="Calibri" w:hAnsi="Calibri"/>
+          <w:b/>
+          <w:color w:val="000000"/>
+          <w:sz w:val="28"/>
+        </w:rPr>
         <w:t>Form Design</w:t>
       </w:r>
     </w:p>
@@ -6800,18 +7070,30 @@
     <w:p>
       <w:pPr>
         <w:pStyle w:val="Heading1"/>
-        <w:spacing w:before="120" w:after="160"/>
+        <w:spacing w:before="240" w:after="160"/>
       </w:pPr>
       <w:r>
+        <w:rPr>
+          <w:rFonts w:ascii="Calibri" w:hAnsi="Calibri"/>
+          <w:b/>
+          <w:color w:val="000000"/>
+          <w:sz w:val="40"/>
+        </w:rPr>
         <w:t>Activity 13</w:t>
       </w:r>
     </w:p>
     <w:p>
       <w:pPr>
         <w:pStyle w:val="Heading2"/>
-        <w:spacing w:before="120" w:after="80"/>
+        <w:spacing w:before="200" w:after="80"/>
       </w:pPr>
       <w:r>
+        <w:rPr>
+          <w:rFonts w:ascii="Calibri" w:hAnsi="Calibri"/>
+          <w:b/>
+          <w:color w:val="000000"/>
+          <w:sz w:val="28"/>
+        </w:rPr>
         <w:t>Source Code</w:t>
       </w:r>
     </w:p>
@@ -9278,9 +9560,15 @@
     <w:p>
       <w:pPr>
         <w:pStyle w:val="Heading2"/>
-        <w:spacing w:before="160" w:after="80"/>
+        <w:spacing w:before="200" w:after="80"/>
       </w:pPr>
       <w:r>
+        <w:rPr>
+          <w:rFonts w:ascii="Calibri" w:hAnsi="Calibri"/>
+          <w:b/>
+          <w:color w:val="000000"/>
+          <w:sz w:val="28"/>
+        </w:rPr>
         <w:t>Sample Run</w:t>
       </w:r>
     </w:p>
@@ -9365,9 +9653,15 @@
     <w:p>
       <w:pPr>
         <w:pStyle w:val="Heading2"/>
-        <w:spacing w:before="160" w:after="80"/>
+        <w:spacing w:before="200" w:after="80"/>
       </w:pPr>
       <w:r>
+        <w:rPr>
+          <w:rFonts w:ascii="Calibri" w:hAnsi="Calibri"/>
+          <w:b/>
+          <w:color w:val="000000"/>
+          <w:sz w:val="28"/>
+        </w:rPr>
         <w:t>Form Design</w:t>
       </w:r>
     </w:p>
@@ -9882,15 +10176,15 @@
     <w:pPr>
       <w:keepNext/>
       <w:keepLines/>
-      <w:spacing w:before="480" w:after="0"/>
+      <w:spacing w:before="240" w:after="160"/>
       <w:outlineLvl w:val="0"/>
     </w:pPr>
     <w:rPr>
-      <w:rFonts w:asciiTheme="majorHAnsi" w:eastAsiaTheme="majorEastAsia" w:hAnsiTheme="majorHAnsi" w:cstheme="majorBidi"/>
+      <w:rFonts w:asciiTheme="majorHAnsi" w:eastAsiaTheme="majorEastAsia" w:hAnsiTheme="majorHAnsi" w:cstheme="majorBidi" w:ascii="Calibri" w:hAnsi="Calibri"/>
       <w:b/>
       <w:bCs/>
-      <w:color w:val="365F91" w:themeColor="accent1" w:themeShade="BF"/>
-      <w:sz w:val="28"/>
+      <w:color w:val="000000"/>
+      <w:sz w:val="40"/>
       <w:szCs w:val="28"/>
     </w:rPr>
   </w:style>
@@ -9906,15 +10200,15 @@
     <w:pPr>
       <w:keepNext/>
       <w:keepLines/>
-      <w:spacing w:before="200" w:after="0"/>
+      <w:spacing w:before="200" w:after="80"/>
       <w:outlineLvl w:val="1"/>
     </w:pPr>
     <w:rPr>
-      <w:rFonts w:asciiTheme="majorHAnsi" w:eastAsiaTheme="majorEastAsia" w:hAnsiTheme="majorHAnsi" w:cstheme="majorBidi"/>
+      <w:rFonts w:asciiTheme="majorHAnsi" w:eastAsiaTheme="majorEastAsia" w:hAnsiTheme="majorHAnsi" w:cstheme="majorBidi" w:ascii="Calibri" w:hAnsi="Calibri"/>
       <w:b/>
       <w:bCs/>
-      <w:color w:val="4F81BD" w:themeColor="accent1"/>
-      <w:sz w:val="26"/>
+      <w:color w:val="000000"/>
+      <w:sz w:val="28"/>
       <w:szCs w:val="26"/>
     </w:rPr>
   </w:style>

</xml_diff>